<commit_message>
feat: add semaine6.docx documentation to Messages directory
</commit_message>
<xml_diff>
--- a/Messages/semaine6.docx
+++ b/Messages/semaine6.docx
@@ -158,6 +158,92 @@
         <w:t xml:space="preserve"> »</w:t>
       </w:r>
     </w:p>
+    <w:p/>
+    <w:p>
+      <w:r>
+        <w:t xml:space="preserve">Bonjour à toutes et à tous </w:t>
+      </w:r>
+      <w:r>
+        <w:rPr>
+          <w:rFonts w:ascii="Segoe UI Emoji" w:hAnsi="Segoe UI Emoji" w:cs="Segoe UI Emoji"/>
+        </w:rPr>
+        <w:t>👋</w:t>
+      </w:r>
+    </w:p>
+    <w:p>
+      <w:r>
+        <w:t xml:space="preserve">Un message capital ce matin car nous abordons le virage le plus important de notre parcours. Le lundi 14 septembre marquera le lancement officiel du Projet Professionnel, la deuxième grande phase de notre formation. Il nous reste donc moins de deux semaines pour finaliser l'intégralité des cinq séquences de cours. À ce jour, nous affichons un taux de complétion moyen de 36 % au sein de la cohorte. Huit d'entre vous ont déjà validé la Phase 1 à 100 %, ce qui démontre que l'objectif est totalement réalisable. </w:t>
+      </w:r>
+    </w:p>
+    <w:p>
+      <w:r>
+        <w:t xml:space="preserve">Pour que l'ensemble du groupe franchisse cette ligne d'arrivée dans les temps, la clé sera l'entraide et la collaboration. Si vous faites partie de ceux qui ont pris de l'avance, prenez quelques minutes pour accompagner un camarade ou partager vos conseils dans le groupe. Si vous accumulez du retard ou éprouvez des blocages sur un module, manifestez-vous sans </w:t>
+      </w:r>
+      <w:r>
+        <w:lastRenderedPageBreak/>
+        <w:t>tarder en privé ou sur le groupe. Nous devons miser sur une dynamique collective pour ne laisser personne de côté.</w:t>
+      </w:r>
+    </w:p>
+    <w:p>
+      <w:r>
+        <w:t>Concernant notre session en direct de ce soir, nous aurons le plaisir d'écouter la présentation du Groupe 2 sur les outils de production de contenus marketing. Nous enchaînerons ensuite directement avec un atelier pratique au cours duquel je vous partagerai des astuces concrètes pour accélérer votre création de contenu et booster vos productions.</w:t>
+      </w:r>
+    </w:p>
+    <w:p/>
+    <w:p/>
+    <w:p>
+      <w:r>
+        <w:t>Bonjour à toutes et à tous,</w:t>
+      </w:r>
+    </w:p>
+    <w:p>
+      <w:r>
+        <w:t>Nous entrons aujourd'hui dans une étape charnière de notre formation en Marketing Numérique. Le lundi 14 septembre débutera officiellement le Projet Professionnel, qui constitue la seconde phase majeure de votre accompagnement. Pour aborder cette étape dans les meilleures conditions, il est impératif d'avoir validé l'ensemble des cinq séquences théoriques avant cette date limite.</w:t>
+      </w:r>
+    </w:p>
+    <w:p>
+      <w:r>
+        <w:t xml:space="preserve">Le bilan actuel de la cohorte indique un taux de complétion moyen de 36 %. Si huit apprenants ont déjà franchi le cap en validant la totalité de la Phase 1, une partie importante du groupe accumule encore du retard sur les séquences intermédiaires. La réussite de cette transition repose désormais sur la solidarité et la collaboration active au sein de la cohorte. J'invite les apprenants les plus avancés à soutenir leurs pairs, et j'encourage vivement celles et ceux qui rencontrent des difficultés à solliciter de l'aide immédiatement au lieu de rester isolés. </w:t>
+      </w:r>
+    </w:p>
+    <w:p>
+      <w:r>
+        <w:t>Dans cette dynamique de mobilisation générale, notre rendez-vous en visioconférence de ce soir sera particulièrement structurant. Nous assisterons en première partie à la présentation du Groupe 2 consacrée aux outils de production de contenus marketing. La seconde partie sera dédiée à un atelier pratique au cours duquel je vous transmettrai des méthodes et astuces pour fluidifier votre création de contenu et accélérer la validation de vos modules.</w:t>
+      </w:r>
+    </w:p>
+    <w:p>
+      <w:r>
+        <w:t xml:space="preserve">Prenez le temps de réorganiser votre agenda cette semaine afin de consacrer un créneau quotidien à votre plateforme. Je reste à votre entière disposition pour vous accompagner sur les éventuels blocages. </w:t>
+      </w:r>
+    </w:p>
+    <w:p>
+      <w:r>
+        <w:t>Excellente journée à tous et à ce soir en session !</w:t>
+      </w:r>
+    </w:p>
+    <w:p>
+      <w:r>
+        <w:t>ADIRIGNO OGOULA Jesse</w:t>
+      </w:r>
+      <w:r>
+        <w:br/>
+        <w:t>Tuteur en Marketing Numérique</w:t>
+      </w:r>
+      <w:r>
+        <w:br/>
+        <w:t>Projet « D-CLIC, formez-vous au numérique avec l’</w:t>
+      </w:r>
+      <w:proofErr w:type="spellStart"/>
+      <w:r>
+        <w:t>OIF</w:t>
+      </w:r>
+      <w:proofErr w:type="spellEnd"/>
+      <w:r>
+        <w:t xml:space="preserve"> »</w:t>
+      </w:r>
+    </w:p>
+    <w:p/>
+    <w:p/>
     <w:p/>
     <w:sectPr>
       <w:pgSz w:w="11906" w:h="16838"/>

</xml_diff>